<commit_message>
Add standalone one-page consent form for Suisse Immo
The consent form now also ships on its own page, without the annex tag,
the explanatory note or the page footer, as a print PDF, a Word file and
a fillable PDF. build_html.py and build_docx.js gain a --form mode; the
fillable PDF is built from that same page. A checkbox now stays on the
same line as the first word of its label.

Co-Authored-By: Claude Opus 5.5 <noreply@anthropic.com>
Claude-Session: https://claude.ai/code/session_01DLRYTzeE75u6diZhhhLmoU
</commit_message>
<xml_diff>
--- a/suisse-immo-si-jur-06/livrables/SI-JUR-06_Prospection-telephonique_Suisse-Immo.docx
+++ b/suisse-immo-si-jur-06/livrables/SI-JUR-06_Prospection-telephonique_Suisse-Immo.docx
@@ -6532,7 +6532,16 @@
                 <w:sz w:val="17"/>
                 <w:szCs w:val="17"/>
               </w:rPr>
-              <w:t xml:space="preserve"> Je souhaite être appelé(e) de préférence : </w:t>
+              <w:t xml:space="preserve"> </w:t>
+            </w:r>
+            <w:r>
+              <w:rPr>
+                <w:rFonts w:ascii="Inter" w:cs="Inter" w:eastAsia="Inter" w:hAnsi="Inter"/>
+                <w:color w:val="15161B"/>
+                <w:sz w:val="17"/>
+                <w:szCs w:val="17"/>
+              </w:rPr>
+              <w:t xml:space="preserve">Je souhaite être appelé(e) de préférence : </w:t>
             </w:r>
             <w:sdt>
               <w:sdtPr>
@@ -6660,7 +6669,16 @@
                 <w:sz w:val="17"/>
                 <w:szCs w:val="17"/>
               </w:rPr>
-              <w:t xml:space="preserve"> Source des données, lorsqu’elles n’ont pas été collectées auprès de vous : </w:t>
+              <w:t xml:space="preserve"> </w:t>
+            </w:r>
+            <w:r>
+              <w:rPr>
+                <w:rFonts w:ascii="Inter" w:cs="Inter" w:eastAsia="Inter" w:hAnsi="Inter"/>
+                <w:color w:val="15161B"/>
+                <w:sz w:val="17"/>
+                <w:szCs w:val="17"/>
+              </w:rPr>
+              <w:t xml:space="preserve">Source des données, lorsqu’elles n’ont pas été collectées auprès de vous : </w:t>
             </w:r>
             <w:sdt>
               <w:sdtPr>

</xml_diff>